<commit_message>
Day 3: PSM Excel + worksheet, ICER/NMB consistency, HR fix, GenAI rewrite with staged prompts
</commit_message>
<xml_diff>
--- a/day2/session5-ckd-markov/Markov-Worksheet.docx
+++ b/day2/session5-ckd-markov/Markov-Worksheet.docx
@@ -286,12 +286,6 @@
         <w:gridCol w:w="1380"/>
       </w:tblGrid>
       <w:tr>
-        <w:tblPrEx>
-          <w:tblCellMar>
-            <w:top w:w="0" w:type="dxa"/>
-            <w:bottom w:w="0" w:type="dxa"/>
-          </w:tblCellMar>
-        </w:tblPrEx>
         <w:tc>
           <w:tcPr>
             <w:tcW w:w="1900" w:type="dxa"/>
@@ -479,12 +473,6 @@
         </w:tc>
       </w:tr>
       <w:tr>
-        <w:tblPrEx>
-          <w:tblCellMar>
-            <w:top w:w="0" w:type="dxa"/>
-            <w:bottom w:w="0" w:type="dxa"/>
-          </w:tblCellMar>
-        </w:tblPrEx>
         <w:tc>
           <w:tcPr>
             <w:tcW w:w="1900" w:type="dxa"/>
@@ -647,12 +635,6 @@
         </w:tc>
       </w:tr>
       <w:tr>
-        <w:tblPrEx>
-          <w:tblCellMar>
-            <w:top w:w="0" w:type="dxa"/>
-            <w:bottom w:w="0" w:type="dxa"/>
-          </w:tblCellMar>
-        </w:tblPrEx>
         <w:tc>
           <w:tcPr>
             <w:tcW w:w="1900" w:type="dxa"/>
@@ -815,12 +797,6 @@
         </w:tc>
       </w:tr>
       <w:tr>
-        <w:tblPrEx>
-          <w:tblCellMar>
-            <w:top w:w="0" w:type="dxa"/>
-            <w:bottom w:w="0" w:type="dxa"/>
-          </w:tblCellMar>
-        </w:tblPrEx>
         <w:tc>
           <w:tcPr>
             <w:tcW w:w="1900" w:type="dxa"/>
@@ -1457,12 +1433,6 @@
         <w:gridCol w:w="1394"/>
       </w:tblGrid>
       <w:tr>
-        <w:tblPrEx>
-          <w:tblCellMar>
-            <w:top w:w="0" w:type="dxa"/>
-            <w:bottom w:w="0" w:type="dxa"/>
-          </w:tblCellMar>
-        </w:tblPrEx>
         <w:tc>
           <w:tcPr>
             <w:tcW w:w="1100" w:type="dxa"/>
@@ -1621,12 +1591,6 @@
         </w:tc>
       </w:tr>
       <w:tr>
-        <w:tblPrEx>
-          <w:tblCellMar>
-            <w:top w:w="0" w:type="dxa"/>
-            <w:bottom w:w="0" w:type="dxa"/>
-          </w:tblCellMar>
-        </w:tblPrEx>
         <w:tc>
           <w:tcPr>
             <w:tcW w:w="1100" w:type="dxa"/>
@@ -1813,12 +1777,6 @@
         </w:tc>
       </w:tr>
       <w:tr>
-        <w:tblPrEx>
-          <w:tblCellMar>
-            <w:top w:w="0" w:type="dxa"/>
-            <w:bottom w:w="0" w:type="dxa"/>
-          </w:tblCellMar>
-        </w:tblPrEx>
         <w:tc>
           <w:tcPr>
             <w:tcW w:w="1100" w:type="dxa"/>
@@ -2005,12 +1963,6 @@
         </w:tc>
       </w:tr>
       <w:tr>
-        <w:tblPrEx>
-          <w:tblCellMar>
-            <w:top w:w="0" w:type="dxa"/>
-            <w:bottom w:w="0" w:type="dxa"/>
-          </w:tblCellMar>
-        </w:tblPrEx>
         <w:tc>
           <w:tcPr>
             <w:tcW w:w="1100" w:type="dxa"/>
@@ -2197,12 +2149,6 @@
         </w:tc>
       </w:tr>
       <w:tr>
-        <w:tblPrEx>
-          <w:tblCellMar>
-            <w:top w:w="0" w:type="dxa"/>
-            <w:bottom w:w="0" w:type="dxa"/>
-          </w:tblCellMar>
-        </w:tblPrEx>
         <w:tc>
           <w:tcPr>
             <w:tcW w:w="1100" w:type="dxa"/>
@@ -2457,12 +2403,6 @@
         <w:gridCol w:w="1394"/>
       </w:tblGrid>
       <w:tr>
-        <w:tblPrEx>
-          <w:tblCellMar>
-            <w:top w:w="0" w:type="dxa"/>
-            <w:bottom w:w="0" w:type="dxa"/>
-          </w:tblCellMar>
-        </w:tblPrEx>
         <w:tc>
           <w:tcPr>
             <w:tcW w:w="1100" w:type="dxa"/>
@@ -2621,12 +2561,6 @@
         </w:tc>
       </w:tr>
       <w:tr>
-        <w:tblPrEx>
-          <w:tblCellMar>
-            <w:top w:w="0" w:type="dxa"/>
-            <w:bottom w:w="0" w:type="dxa"/>
-          </w:tblCellMar>
-        </w:tblPrEx>
         <w:tc>
           <w:tcPr>
             <w:tcW w:w="1100" w:type="dxa"/>
@@ -2803,12 +2737,6 @@
         </w:tc>
       </w:tr>
       <w:tr>
-        <w:tblPrEx>
-          <w:tblCellMar>
-            <w:top w:w="0" w:type="dxa"/>
-            <w:bottom w:w="0" w:type="dxa"/>
-          </w:tblCellMar>
-        </w:tblPrEx>
         <w:tc>
           <w:tcPr>
             <w:tcW w:w="1100" w:type="dxa"/>
@@ -2985,12 +2913,6 @@
         </w:tc>
       </w:tr>
       <w:tr>
-        <w:tblPrEx>
-          <w:tblCellMar>
-            <w:top w:w="0" w:type="dxa"/>
-            <w:bottom w:w="0" w:type="dxa"/>
-          </w:tblCellMar>
-        </w:tblPrEx>
         <w:tc>
           <w:tcPr>
             <w:tcW w:w="1100" w:type="dxa"/>
@@ -3167,12 +3089,6 @@
         </w:tc>
       </w:tr>
       <w:tr>
-        <w:tblPrEx>
-          <w:tblCellMar>
-            <w:top w:w="0" w:type="dxa"/>
-            <w:bottom w:w="0" w:type="dxa"/>
-          </w:tblCellMar>
-        </w:tblPrEx>
         <w:tc>
           <w:tcPr>
             <w:tcW w:w="1100" w:type="dxa"/>
@@ -3373,12 +3289,6 @@
         <w:gridCol w:w="1394"/>
       </w:tblGrid>
       <w:tr>
-        <w:tblPrEx>
-          <w:tblCellMar>
-            <w:top w:w="0" w:type="dxa"/>
-            <w:bottom w:w="0" w:type="dxa"/>
-          </w:tblCellMar>
-        </w:tblPrEx>
         <w:tc>
           <w:tcPr>
             <w:tcW w:w="1100" w:type="dxa"/>
@@ -3537,12 +3447,6 @@
         </w:tc>
       </w:tr>
       <w:tr>
-        <w:tblPrEx>
-          <w:tblCellMar>
-            <w:top w:w="0" w:type="dxa"/>
-            <w:bottom w:w="0" w:type="dxa"/>
-          </w:tblCellMar>
-        </w:tblPrEx>
         <w:tc>
           <w:tcPr>
             <w:tcW w:w="1100" w:type="dxa"/>
@@ -3709,12 +3613,6 @@
         </w:tc>
       </w:tr>
       <w:tr>
-        <w:tblPrEx>
-          <w:tblCellMar>
-            <w:top w:w="0" w:type="dxa"/>
-            <w:bottom w:w="0" w:type="dxa"/>
-          </w:tblCellMar>
-        </w:tblPrEx>
         <w:tc>
           <w:tcPr>
             <w:tcW w:w="1100" w:type="dxa"/>
@@ -3881,12 +3779,6 @@
         </w:tc>
       </w:tr>
       <w:tr>
-        <w:tblPrEx>
-          <w:tblCellMar>
-            <w:top w:w="0" w:type="dxa"/>
-            <w:bottom w:w="0" w:type="dxa"/>
-          </w:tblCellMar>
-        </w:tblPrEx>
         <w:tc>
           <w:tcPr>
             <w:tcW w:w="1100" w:type="dxa"/>
@@ -4053,12 +3945,6 @@
         </w:tc>
       </w:tr>
       <w:tr>
-        <w:tblPrEx>
-          <w:tblCellMar>
-            <w:top w:w="0" w:type="dxa"/>
-            <w:bottom w:w="0" w:type="dxa"/>
-          </w:tblCellMar>
-        </w:tblPrEx>
         <w:tc>
           <w:tcPr>
             <w:tcW w:w="1100" w:type="dxa"/>
@@ -4251,12 +4137,6 @@
         <w:gridCol w:w="1380"/>
       </w:tblGrid>
       <w:tr>
-        <w:tblPrEx>
-          <w:tblCellMar>
-            <w:top w:w="0" w:type="dxa"/>
-            <w:bottom w:w="0" w:type="dxa"/>
-          </w:tblCellMar>
-        </w:tblPrEx>
         <w:tc>
           <w:tcPr>
             <w:tcW w:w="900" w:type="dxa"/>
@@ -4444,12 +4324,6 @@
         </w:tc>
       </w:tr>
       <w:tr>
-        <w:tblPrEx>
-          <w:tblCellMar>
-            <w:top w:w="0" w:type="dxa"/>
-            <w:bottom w:w="0" w:type="dxa"/>
-          </w:tblCellMar>
-        </w:tblPrEx>
         <w:tc>
           <w:tcPr>
             <w:tcW w:w="900" w:type="dxa"/>
@@ -4626,12 +4500,6 @@
         </w:tc>
       </w:tr>
       <w:tr>
-        <w:tblPrEx>
-          <w:tblCellMar>
-            <w:top w:w="0" w:type="dxa"/>
-            <w:bottom w:w="0" w:type="dxa"/>
-          </w:tblCellMar>
-        </w:tblPrEx>
         <w:tc>
           <w:tcPr>
             <w:tcW w:w="900" w:type="dxa"/>
@@ -4898,12 +4766,6 @@
         <w:gridCol w:w="1394"/>
       </w:tblGrid>
       <w:tr>
-        <w:tblPrEx>
-          <w:tblCellMar>
-            <w:top w:w="0" w:type="dxa"/>
-            <w:bottom w:w="0" w:type="dxa"/>
-          </w:tblCellMar>
-        </w:tblPrEx>
         <w:tc>
           <w:tcPr>
             <w:tcW w:w="1100" w:type="dxa"/>
@@ -5062,12 +4924,6 @@
         </w:tc>
       </w:tr>
       <w:tr>
-        <w:tblPrEx>
-          <w:tblCellMar>
-            <w:top w:w="0" w:type="dxa"/>
-            <w:bottom w:w="0" w:type="dxa"/>
-          </w:tblCellMar>
-        </w:tblPrEx>
         <w:tc>
           <w:tcPr>
             <w:tcW w:w="1100" w:type="dxa"/>
@@ -5244,12 +5100,6 @@
         </w:tc>
       </w:tr>
       <w:tr>
-        <w:tblPrEx>
-          <w:tblCellMar>
-            <w:top w:w="0" w:type="dxa"/>
-            <w:bottom w:w="0" w:type="dxa"/>
-          </w:tblCellMar>
-        </w:tblPrEx>
         <w:tc>
           <w:tcPr>
             <w:tcW w:w="1100" w:type="dxa"/>
@@ -5426,12 +5276,6 @@
         </w:tc>
       </w:tr>
       <w:tr>
-        <w:tblPrEx>
-          <w:tblCellMar>
-            <w:top w:w="0" w:type="dxa"/>
-            <w:bottom w:w="0" w:type="dxa"/>
-          </w:tblCellMar>
-        </w:tblPrEx>
         <w:tc>
           <w:tcPr>
             <w:tcW w:w="1100" w:type="dxa"/>
@@ -5608,12 +5452,6 @@
         </w:tc>
       </w:tr>
       <w:tr>
-        <w:tblPrEx>
-          <w:tblCellMar>
-            <w:top w:w="0" w:type="dxa"/>
-            <w:bottom w:w="0" w:type="dxa"/>
-          </w:tblCellMar>
-        </w:tblPrEx>
         <w:tc>
           <w:tcPr>
             <w:tcW w:w="1100" w:type="dxa"/>
@@ -5814,12 +5652,6 @@
         <w:gridCol w:w="1394"/>
       </w:tblGrid>
       <w:tr>
-        <w:tblPrEx>
-          <w:tblCellMar>
-            <w:top w:w="0" w:type="dxa"/>
-            <w:bottom w:w="0" w:type="dxa"/>
-          </w:tblCellMar>
-        </w:tblPrEx>
         <w:tc>
           <w:tcPr>
             <w:tcW w:w="1100" w:type="dxa"/>
@@ -5978,12 +5810,6 @@
         </w:tc>
       </w:tr>
       <w:tr>
-        <w:tblPrEx>
-          <w:tblCellMar>
-            <w:top w:w="0" w:type="dxa"/>
-            <w:bottom w:w="0" w:type="dxa"/>
-          </w:tblCellMar>
-        </w:tblPrEx>
         <w:tc>
           <w:tcPr>
             <w:tcW w:w="1100" w:type="dxa"/>
@@ -6160,12 +5986,6 @@
         </w:tc>
       </w:tr>
       <w:tr>
-        <w:tblPrEx>
-          <w:tblCellMar>
-            <w:top w:w="0" w:type="dxa"/>
-            <w:bottom w:w="0" w:type="dxa"/>
-          </w:tblCellMar>
-        </w:tblPrEx>
         <w:tc>
           <w:tcPr>
             <w:tcW w:w="1100" w:type="dxa"/>
@@ -6342,12 +6162,6 @@
         </w:tc>
       </w:tr>
       <w:tr>
-        <w:tblPrEx>
-          <w:tblCellMar>
-            <w:top w:w="0" w:type="dxa"/>
-            <w:bottom w:w="0" w:type="dxa"/>
-          </w:tblCellMar>
-        </w:tblPrEx>
         <w:tc>
           <w:tcPr>
             <w:tcW w:w="1100" w:type="dxa"/>
@@ -6524,12 +6338,6 @@
         </w:tc>
       </w:tr>
       <w:tr>
-        <w:tblPrEx>
-          <w:tblCellMar>
-            <w:top w:w="0" w:type="dxa"/>
-            <w:bottom w:w="0" w:type="dxa"/>
-          </w:tblCellMar>
-        </w:tblPrEx>
         <w:tc>
           <w:tcPr>
             <w:tcW w:w="1100" w:type="dxa"/>
@@ -6750,12 +6558,6 @@
         <w:gridCol w:w="1394"/>
       </w:tblGrid>
       <w:tr>
-        <w:tblPrEx>
-          <w:tblCellMar>
-            <w:top w:w="0" w:type="dxa"/>
-            <w:bottom w:w="0" w:type="dxa"/>
-          </w:tblCellMar>
-        </w:tblPrEx>
         <w:tc>
           <w:tcPr>
             <w:tcW w:w="1100" w:type="dxa"/>
@@ -6914,12 +6716,6 @@
         </w:tc>
       </w:tr>
       <w:tr>
-        <w:tblPrEx>
-          <w:tblCellMar>
-            <w:top w:w="0" w:type="dxa"/>
-            <w:bottom w:w="0" w:type="dxa"/>
-          </w:tblCellMar>
-        </w:tblPrEx>
         <w:tc>
           <w:tcPr>
             <w:tcW w:w="1100" w:type="dxa"/>
@@ -7096,12 +6892,6 @@
         </w:tc>
       </w:tr>
       <w:tr>
-        <w:tblPrEx>
-          <w:tblCellMar>
-            <w:top w:w="0" w:type="dxa"/>
-            <w:bottom w:w="0" w:type="dxa"/>
-          </w:tblCellMar>
-        </w:tblPrEx>
         <w:tc>
           <w:tcPr>
             <w:tcW w:w="1100" w:type="dxa"/>
@@ -7278,12 +7068,6 @@
         </w:tc>
       </w:tr>
       <w:tr>
-        <w:tblPrEx>
-          <w:tblCellMar>
-            <w:top w:w="0" w:type="dxa"/>
-            <w:bottom w:w="0" w:type="dxa"/>
-          </w:tblCellMar>
-        </w:tblPrEx>
         <w:tc>
           <w:tcPr>
             <w:tcW w:w="1100" w:type="dxa"/>
@@ -7460,12 +7244,6 @@
         </w:tc>
       </w:tr>
       <w:tr>
-        <w:tblPrEx>
-          <w:tblCellMar>
-            <w:top w:w="0" w:type="dxa"/>
-            <w:bottom w:w="0" w:type="dxa"/>
-          </w:tblCellMar>
-        </w:tblPrEx>
         <w:tc>
           <w:tcPr>
             <w:tcW w:w="1100" w:type="dxa"/>
@@ -7677,12 +7455,6 @@
         <w:gridCol w:w="1380"/>
       </w:tblGrid>
       <w:tr>
-        <w:tblPrEx>
-          <w:tblCellMar>
-            <w:top w:w="0" w:type="dxa"/>
-            <w:bottom w:w="0" w:type="dxa"/>
-          </w:tblCellMar>
-        </w:tblPrEx>
         <w:tc>
           <w:tcPr>
             <w:tcW w:w="900" w:type="dxa"/>
@@ -7870,12 +7642,6 @@
         </w:tc>
       </w:tr>
       <w:tr>
-        <w:tblPrEx>
-          <w:tblCellMar>
-            <w:top w:w="0" w:type="dxa"/>
-            <w:bottom w:w="0" w:type="dxa"/>
-          </w:tblCellMar>
-        </w:tblPrEx>
         <w:tc>
           <w:tcPr>
             <w:tcW w:w="900" w:type="dxa"/>
@@ -8052,12 +7818,6 @@
         </w:tc>
       </w:tr>
       <w:tr>
-        <w:tblPrEx>
-          <w:tblCellMar>
-            <w:top w:w="0" w:type="dxa"/>
-            <w:bottom w:w="0" w:type="dxa"/>
-          </w:tblCellMar>
-        </w:tblPrEx>
         <w:tc>
           <w:tcPr>
             <w:tcW w:w="900" w:type="dxa"/>
@@ -8327,12 +8087,6 @@
         <w:gridCol w:w="1394"/>
       </w:tblGrid>
       <w:tr>
-        <w:tblPrEx>
-          <w:tblCellMar>
-            <w:top w:w="0" w:type="dxa"/>
-            <w:bottom w:w="0" w:type="dxa"/>
-          </w:tblCellMar>
-        </w:tblPrEx>
         <w:tc>
           <w:tcPr>
             <w:tcW w:w="1100" w:type="dxa"/>
@@ -8491,12 +8245,6 @@
         </w:tc>
       </w:tr>
       <w:tr>
-        <w:tblPrEx>
-          <w:tblCellMar>
-            <w:top w:w="0" w:type="dxa"/>
-            <w:bottom w:w="0" w:type="dxa"/>
-          </w:tblCellMar>
-        </w:tblPrEx>
         <w:tc>
           <w:tcPr>
             <w:tcW w:w="1100" w:type="dxa"/>
@@ -8673,12 +8421,6 @@
         </w:tc>
       </w:tr>
       <w:tr>
-        <w:tblPrEx>
-          <w:tblCellMar>
-            <w:top w:w="0" w:type="dxa"/>
-            <w:bottom w:w="0" w:type="dxa"/>
-          </w:tblCellMar>
-        </w:tblPrEx>
         <w:tc>
           <w:tcPr>
             <w:tcW w:w="1100" w:type="dxa"/>
@@ -8855,12 +8597,6 @@
         </w:tc>
       </w:tr>
       <w:tr>
-        <w:tblPrEx>
-          <w:tblCellMar>
-            <w:top w:w="0" w:type="dxa"/>
-            <w:bottom w:w="0" w:type="dxa"/>
-          </w:tblCellMar>
-        </w:tblPrEx>
         <w:tc>
           <w:tcPr>
             <w:tcW w:w="1100" w:type="dxa"/>
@@ -9037,12 +8773,6 @@
         </w:tc>
       </w:tr>
       <w:tr>
-        <w:tblPrEx>
-          <w:tblCellMar>
-            <w:top w:w="0" w:type="dxa"/>
-            <w:bottom w:w="0" w:type="dxa"/>
-          </w:tblCellMar>
-        </w:tblPrEx>
         <w:tc>
           <w:tcPr>
             <w:tcW w:w="1100" w:type="dxa"/>
@@ -9243,12 +8973,6 @@
         <w:gridCol w:w="1394"/>
       </w:tblGrid>
       <w:tr>
-        <w:tblPrEx>
-          <w:tblCellMar>
-            <w:top w:w="0" w:type="dxa"/>
-            <w:bottom w:w="0" w:type="dxa"/>
-          </w:tblCellMar>
-        </w:tblPrEx>
         <w:tc>
           <w:tcPr>
             <w:tcW w:w="1100" w:type="dxa"/>
@@ -9407,12 +9131,6 @@
         </w:tc>
       </w:tr>
       <w:tr>
-        <w:tblPrEx>
-          <w:tblCellMar>
-            <w:top w:w="0" w:type="dxa"/>
-            <w:bottom w:w="0" w:type="dxa"/>
-          </w:tblCellMar>
-        </w:tblPrEx>
         <w:tc>
           <w:tcPr>
             <w:tcW w:w="1100" w:type="dxa"/>
@@ -9589,12 +9307,6 @@
         </w:tc>
       </w:tr>
       <w:tr>
-        <w:tblPrEx>
-          <w:tblCellMar>
-            <w:top w:w="0" w:type="dxa"/>
-            <w:bottom w:w="0" w:type="dxa"/>
-          </w:tblCellMar>
-        </w:tblPrEx>
         <w:tc>
           <w:tcPr>
             <w:tcW w:w="1100" w:type="dxa"/>
@@ -9771,12 +9483,6 @@
         </w:tc>
       </w:tr>
       <w:tr>
-        <w:tblPrEx>
-          <w:tblCellMar>
-            <w:top w:w="0" w:type="dxa"/>
-            <w:bottom w:w="0" w:type="dxa"/>
-          </w:tblCellMar>
-        </w:tblPrEx>
         <w:tc>
           <w:tcPr>
             <w:tcW w:w="1100" w:type="dxa"/>
@@ -9953,12 +9659,6 @@
         </w:tc>
       </w:tr>
       <w:tr>
-        <w:tblPrEx>
-          <w:tblCellMar>
-            <w:top w:w="0" w:type="dxa"/>
-            <w:bottom w:w="0" w:type="dxa"/>
-          </w:tblCellMar>
-        </w:tblPrEx>
         <w:tc>
           <w:tcPr>
             <w:tcW w:w="1100" w:type="dxa"/>
@@ -10159,12 +9859,6 @@
         <w:gridCol w:w="1394"/>
       </w:tblGrid>
       <w:tr>
-        <w:tblPrEx>
-          <w:tblCellMar>
-            <w:top w:w="0" w:type="dxa"/>
-            <w:bottom w:w="0" w:type="dxa"/>
-          </w:tblCellMar>
-        </w:tblPrEx>
         <w:tc>
           <w:tcPr>
             <w:tcW w:w="1100" w:type="dxa"/>
@@ -10323,12 +10017,6 @@
         </w:tc>
       </w:tr>
       <w:tr>
-        <w:tblPrEx>
-          <w:tblCellMar>
-            <w:top w:w="0" w:type="dxa"/>
-            <w:bottom w:w="0" w:type="dxa"/>
-          </w:tblCellMar>
-        </w:tblPrEx>
         <w:tc>
           <w:tcPr>
             <w:tcW w:w="1100" w:type="dxa"/>
@@ -10505,12 +10193,6 @@
         </w:tc>
       </w:tr>
       <w:tr>
-        <w:tblPrEx>
-          <w:tblCellMar>
-            <w:top w:w="0" w:type="dxa"/>
-            <w:bottom w:w="0" w:type="dxa"/>
-          </w:tblCellMar>
-        </w:tblPrEx>
         <w:tc>
           <w:tcPr>
             <w:tcW w:w="1100" w:type="dxa"/>
@@ -10687,12 +10369,6 @@
         </w:tc>
       </w:tr>
       <w:tr>
-        <w:tblPrEx>
-          <w:tblCellMar>
-            <w:top w:w="0" w:type="dxa"/>
-            <w:bottom w:w="0" w:type="dxa"/>
-          </w:tblCellMar>
-        </w:tblPrEx>
         <w:tc>
           <w:tcPr>
             <w:tcW w:w="1100" w:type="dxa"/>
@@ -10869,12 +10545,6 @@
         </w:tc>
       </w:tr>
       <w:tr>
-        <w:tblPrEx>
-          <w:tblCellMar>
-            <w:top w:w="0" w:type="dxa"/>
-            <w:bottom w:w="0" w:type="dxa"/>
-          </w:tblCellMar>
-        </w:tblPrEx>
         <w:tc>
           <w:tcPr>
             <w:tcW w:w="1100" w:type="dxa"/>
@@ -11068,12 +10738,6 @@
         <w:gridCol w:w="1380"/>
       </w:tblGrid>
       <w:tr>
-        <w:tblPrEx>
-          <w:tblCellMar>
-            <w:top w:w="0" w:type="dxa"/>
-            <w:bottom w:w="0" w:type="dxa"/>
-          </w:tblCellMar>
-        </w:tblPrEx>
         <w:tc>
           <w:tcPr>
             <w:tcW w:w="900" w:type="dxa"/>
@@ -11261,12 +10925,6 @@
         </w:tc>
       </w:tr>
       <w:tr>
-        <w:tblPrEx>
-          <w:tblCellMar>
-            <w:top w:w="0" w:type="dxa"/>
-            <w:bottom w:w="0" w:type="dxa"/>
-          </w:tblCellMar>
-        </w:tblPrEx>
         <w:tc>
           <w:tcPr>
             <w:tcW w:w="900" w:type="dxa"/>
@@ -11443,12 +11101,6 @@
         </w:tc>
       </w:tr>
       <w:tr>
-        <w:tblPrEx>
-          <w:tblCellMar>
-            <w:top w:w="0" w:type="dxa"/>
-            <w:bottom w:w="0" w:type="dxa"/>
-          </w:tblCellMar>
-        </w:tblPrEx>
         <w:tc>
           <w:tcPr>
             <w:tcW w:w="900" w:type="dxa"/>
@@ -11668,12 +11320,6 @@
         <w:gridCol w:w="1380"/>
       </w:tblGrid>
       <w:tr>
-        <w:tblPrEx>
-          <w:tblCellMar>
-            <w:top w:w="0" w:type="dxa"/>
-            <w:bottom w:w="0" w:type="dxa"/>
-          </w:tblCellMar>
-        </w:tblPrEx>
         <w:tc>
           <w:tcPr>
             <w:tcW w:w="900" w:type="dxa"/>
@@ -11861,12 +11507,6 @@
         </w:tc>
       </w:tr>
       <w:tr>
-        <w:tblPrEx>
-          <w:tblCellMar>
-            <w:top w:w="0" w:type="dxa"/>
-            <w:bottom w:w="0" w:type="dxa"/>
-          </w:tblCellMar>
-        </w:tblPrEx>
         <w:tc>
           <w:tcPr>
             <w:tcW w:w="900" w:type="dxa"/>
@@ -12043,12 +11683,6 @@
         </w:tc>
       </w:tr>
       <w:tr>
-        <w:tblPrEx>
-          <w:tblCellMar>
-            <w:top w:w="0" w:type="dxa"/>
-            <w:bottom w:w="0" w:type="dxa"/>
-          </w:tblCellMar>
-        </w:tblPrEx>
         <w:tc>
           <w:tcPr>
             <w:tcW w:w="900" w:type="dxa"/>
@@ -12199,12 +11833,6 @@
         </w:tc>
       </w:tr>
       <w:tr>
-        <w:tblPrEx>
-          <w:tblCellMar>
-            <w:top w:w="0" w:type="dxa"/>
-            <w:bottom w:w="0" w:type="dxa"/>
-          </w:tblCellMar>
-        </w:tblPrEx>
         <w:tc>
           <w:tcPr>
             <w:tcW w:w="900" w:type="dxa"/>
@@ -12355,12 +11983,6 @@
         </w:tc>
       </w:tr>
       <w:tr>
-        <w:tblPrEx>
-          <w:tblCellMar>
-            <w:top w:w="0" w:type="dxa"/>
-            <w:bottom w:w="0" w:type="dxa"/>
-          </w:tblCellMar>
-        </w:tblPrEx>
         <w:tc>
           <w:tcPr>
             <w:tcW w:w="900" w:type="dxa"/>
@@ -12631,12 +12253,6 @@
         <w:gridCol w:w="1500"/>
       </w:tblGrid>
       <w:tr>
-        <w:tblPrEx>
-          <w:tblCellMar>
-            <w:top w:w="0" w:type="dxa"/>
-            <w:bottom w:w="0" w:type="dxa"/>
-          </w:tblCellMar>
-        </w:tblPrEx>
         <w:tc>
           <w:tcPr>
             <w:tcW w:w="2800" w:type="dxa"/>
@@ -12777,12 +12393,6 @@
         </w:tc>
       </w:tr>
       <w:tr>
-        <w:tblPrEx>
-          <w:tblCellMar>
-            <w:top w:w="0" w:type="dxa"/>
-            <w:bottom w:w="0" w:type="dxa"/>
-          </w:tblCellMar>
-        </w:tblPrEx>
         <w:tc>
           <w:tcPr>
             <w:tcW w:w="2800" w:type="dxa"/>
@@ -12922,12 +12532,6 @@
         </w:tc>
       </w:tr>
       <w:tr>
-        <w:tblPrEx>
-          <w:tblCellMar>
-            <w:top w:w="0" w:type="dxa"/>
-            <w:bottom w:w="0" w:type="dxa"/>
-          </w:tblCellMar>
-        </w:tblPrEx>
         <w:tc>
           <w:tcPr>
             <w:tcW w:w="2800" w:type="dxa"/>
@@ -13067,12 +12671,6 @@
         </w:tc>
       </w:tr>
       <w:tr>
-        <w:tblPrEx>
-          <w:tblCellMar>
-            <w:top w:w="0" w:type="dxa"/>
-            <w:bottom w:w="0" w:type="dxa"/>
-          </w:tblCellMar>
-        </w:tblPrEx>
         <w:tc>
           <w:tcPr>
             <w:tcW w:w="2800" w:type="dxa"/>
@@ -13299,12 +12897,6 @@
         <w:gridCol w:w="1800"/>
       </w:tblGrid>
       <w:tr>
-        <w:tblPrEx>
-          <w:tblCellMar>
-            <w:top w:w="0" w:type="dxa"/>
-            <w:bottom w:w="0" w:type="dxa"/>
-          </w:tblCellMar>
-        </w:tblPrEx>
         <w:tc>
           <w:tcPr>
             <w:tcW w:w="1800" w:type="dxa"/>
@@ -13418,12 +13010,6 @@
         </w:tc>
       </w:tr>
       <w:tr>
-        <w:tblPrEx>
-          <w:tblCellMar>
-            <w:top w:w="0" w:type="dxa"/>
-            <w:bottom w:w="0" w:type="dxa"/>
-          </w:tblCellMar>
-        </w:tblPrEx>
         <w:tc>
           <w:tcPr>
             <w:tcW w:w="1800" w:type="dxa"/>
@@ -13532,12 +13118,6 @@
         </w:tc>
       </w:tr>
       <w:tr>
-        <w:tblPrEx>
-          <w:tblCellMar>
-            <w:top w:w="0" w:type="dxa"/>
-            <w:bottom w:w="0" w:type="dxa"/>
-          </w:tblCellMar>
-        </w:tblPrEx>
         <w:tc>
           <w:tcPr>
             <w:tcW w:w="1800" w:type="dxa"/>
@@ -13638,12 +13218,6 @@
         </w:tc>
       </w:tr>
       <w:tr>
-        <w:tblPrEx>
-          <w:tblCellMar>
-            <w:top w:w="0" w:type="dxa"/>
-            <w:bottom w:w="0" w:type="dxa"/>
-          </w:tblCellMar>
-        </w:tblPrEx>
         <w:tc>
           <w:tcPr>
             <w:tcW w:w="1800" w:type="dxa"/>
@@ -13812,12 +13386,6 @@
         <w:gridCol w:w="1800"/>
       </w:tblGrid>
       <w:tr>
-        <w:tblPrEx>
-          <w:tblCellMar>
-            <w:top w:w="0" w:type="dxa"/>
-            <w:bottom w:w="0" w:type="dxa"/>
-          </w:tblCellMar>
-        </w:tblPrEx>
         <w:tc>
           <w:tcPr>
             <w:tcW w:w="2200" w:type="dxa"/>
@@ -13950,12 +13518,6 @@
         </w:tc>
       </w:tr>
       <w:tr>
-        <w:tblPrEx>
-          <w:tblCellMar>
-            <w:top w:w="0" w:type="dxa"/>
-            <w:bottom w:w="0" w:type="dxa"/>
-          </w:tblCellMar>
-        </w:tblPrEx>
         <w:tc>
           <w:tcPr>
             <w:tcW w:w="2200" w:type="dxa"/>
@@ -14062,12 +13624,6 @@
         </w:tc>
       </w:tr>
       <w:tr>
-        <w:tblPrEx>
-          <w:tblCellMar>
-            <w:top w:w="0" w:type="dxa"/>
-            <w:bottom w:w="0" w:type="dxa"/>
-          </w:tblCellMar>
-        </w:tblPrEx>
         <w:tc>
           <w:tcPr>
             <w:tcW w:w="2200" w:type="dxa"/>
@@ -14174,12 +13730,6 @@
         </w:tc>
       </w:tr>
       <w:tr>
-        <w:tblPrEx>
-          <w:tblCellMar>
-            <w:top w:w="0" w:type="dxa"/>
-            <w:bottom w:w="0" w:type="dxa"/>
-          </w:tblCellMar>
-        </w:tblPrEx>
         <w:tc>
           <w:tcPr>
             <w:tcW w:w="2200" w:type="dxa"/>
@@ -14335,12 +13885,6 @@
         <w:gridCol w:w="2200"/>
       </w:tblGrid>
       <w:tr>
-        <w:tblPrEx>
-          <w:tblCellMar>
-            <w:top w:w="0" w:type="dxa"/>
-            <w:bottom w:w="0" w:type="dxa"/>
-          </w:tblCellMar>
-        </w:tblPrEx>
         <w:tc>
           <w:tcPr>
             <w:tcW w:w="4500" w:type="dxa"/>
@@ -14406,12 +13950,6 @@
         </w:tc>
       </w:tr>
       <w:tr>
-        <w:tblPrEx>
-          <w:tblCellMar>
-            <w:top w:w="0" w:type="dxa"/>
-            <w:bottom w:w="0" w:type="dxa"/>
-          </w:tblCellMar>
-        </w:tblPrEx>
         <w:tc>
           <w:tcPr>
             <w:tcW w:w="4500" w:type="dxa"/>
@@ -14477,12 +14015,6 @@
         </w:tc>
       </w:tr>
       <w:tr>
-        <w:tblPrEx>
-          <w:tblCellMar>
-            <w:top w:w="0" w:type="dxa"/>
-            <w:bottom w:w="0" w:type="dxa"/>
-          </w:tblCellMar>
-        </w:tblPrEx>
         <w:tc>
           <w:tcPr>
             <w:tcW w:w="4500" w:type="dxa"/>

</xml_diff>